<commit_message>
Update Module Introduction Sample Problem Solution.docx
</commit_message>
<xml_diff>
--- a/Module Introduction Sample Problem Solution.docx
+++ b/Module Introduction Sample Problem Solution.docx
@@ -108,13 +108,7 @@
     </w:p>
     <w:p>
       <w:r>
-        <w:t>SEARCH module to search for books on the system</w:t>
-      </w:r>
-      <w:r>
-        <w:t xml:space="preserve"> and return </w:t>
-      </w:r>
-      <w:r>
-        <w:t>the information status of the book</w:t>
+        <w:t>SEARCH module to search for books on the system and return the information status of the book</w:t>
       </w:r>
     </w:p>
     <w:p>
@@ -262,8 +256,6 @@
     <w:p>
       <w:r>
         <w:tab/>
-      </w:r>
-      <w:r>
         <w:t>Give Librarian my card for the id ???</w:t>
       </w:r>
     </w:p>
@@ -378,12 +370,202 @@
     </w:p>
     <w:p>
       <w:r>
+        <w:t>Modules</w:t>
+      </w:r>
+    </w:p>
+    <w:p>
+      <w:pPr>
+        <w:pStyle w:val="ListParagraph"/>
+        <w:numPr>
+          <w:ilvl w:val="0"/>
+          <w:numId w:val="1"/>
+        </w:numPr>
+      </w:pPr>
+      <w:r>
+        <w:t>POKEMON SIGN IN to the conference at the greeting table</w:t>
+      </w:r>
+    </w:p>
+    <w:p>
+      <w:pPr>
+        <w:pStyle w:val="ListParagraph"/>
+        <w:numPr>
+          <w:ilvl w:val="0"/>
+          <w:numId w:val="1"/>
+        </w:numPr>
+      </w:pPr>
+      <w:r>
+        <w:t>PRINT BADGE for the Pokémon</w:t>
+      </w:r>
+    </w:p>
+    <w:p>
+      <w:pPr>
+        <w:pStyle w:val="ListParagraph"/>
+        <w:numPr>
+          <w:ilvl w:val="0"/>
+          <w:numId w:val="1"/>
+        </w:numPr>
+      </w:pPr>
+      <w:r>
+        <w:t>REGISTER POKEMON for the conference</w:t>
+      </w:r>
+    </w:p>
+    <w:p>
+      <w:r>
+        <w:t>POKEMON SIGN IN</w:t>
+      </w:r>
+    </w:p>
+    <w:p>
+      <w:pPr>
+        <w:ind w:left="720"/>
+      </w:pPr>
+      <w:r>
+        <w:t>1. Receive card</w:t>
+      </w:r>
+    </w:p>
+    <w:p>
+      <w:pPr>
+        <w:ind w:left="720"/>
+      </w:pPr>
+      <w:r>
+        <w:t>2. Write name</w:t>
+      </w:r>
+    </w:p>
+    <w:p>
+      <w:pPr>
+        <w:ind w:left="720"/>
+      </w:pPr>
+      <w:r>
+        <w:t>3. Write type</w:t>
+      </w:r>
+    </w:p>
+    <w:p>
+      <w:pPr>
+        <w:ind w:left="720"/>
+      </w:pPr>
+      <w:r>
+        <w:t>4. Write trainer name (if you have one)</w:t>
+      </w:r>
+    </w:p>
+    <w:p>
+      <w:pPr>
+        <w:ind w:left="720"/>
+      </w:pPr>
+      <w:r>
+        <w:t>5. Confirm if participating in battle</w:t>
+      </w:r>
+    </w:p>
+    <w:p>
+      <w:r>
+        <w:t>PRINT BADGE</w:t>
+      </w:r>
+    </w:p>
+    <w:p>
+      <w:pPr>
+        <w:ind w:left="720"/>
+      </w:pPr>
+      <w:r>
+        <w:t>1. Open Pokémon details</w:t>
+      </w:r>
+    </w:p>
+    <w:p>
+      <w:pPr>
+        <w:ind w:left="720"/>
+      </w:pPr>
+      <w:r>
+        <w:t>2. Click PRINT badge</w:t>
+      </w:r>
+    </w:p>
+    <w:p>
+      <w:pPr>
+        <w:ind w:left="720"/>
+      </w:pPr>
+      <w:r>
+        <w:t>3. Wait for badge to print</w:t>
+      </w:r>
+    </w:p>
+    <w:p>
+      <w:pPr>
+        <w:ind w:left="720"/>
+      </w:pPr>
+      <w:r>
+        <w:t>4. Hand badge to Pokémon</w:t>
+      </w:r>
+    </w:p>
+    <w:p>
+      <w:r>
         <w:br w:type="page"/>
       </w:r>
     </w:p>
-    <w:p/>
-    <w:p>
-      <w:r>
+    <w:p>
+      <w:r>
+        <w:lastRenderedPageBreak/>
+        <w:t>REGISTER POKEMON</w:t>
+      </w:r>
+    </w:p>
+    <w:p>
+      <w:pPr>
+        <w:ind w:left="720"/>
+      </w:pPr>
+      <w:r>
+        <w:t>1. Receive completed card</w:t>
+      </w:r>
+    </w:p>
+    <w:p>
+      <w:pPr>
+        <w:ind w:left="720"/>
+      </w:pPr>
+      <w:r>
+        <w:t>2. Enter name</w:t>
+      </w:r>
+    </w:p>
+    <w:p>
+      <w:pPr>
+        <w:ind w:left="720"/>
+      </w:pPr>
+      <w:r>
+        <w:t>3. Enter type</w:t>
+      </w:r>
+    </w:p>
+    <w:p>
+      <w:pPr>
+        <w:ind w:left="720"/>
+      </w:pPr>
+      <w:r>
+        <w:t>4. Enter trainer (if there is one)</w:t>
+      </w:r>
+    </w:p>
+    <w:p>
+      <w:pPr>
+        <w:ind w:left="720"/>
+      </w:pPr>
+      <w:r>
+        <w:t>5. Enter battle participation status</w:t>
+      </w:r>
+    </w:p>
+    <w:p>
+      <w:pPr>
+        <w:ind w:left="720"/>
+      </w:pPr>
+      <w:r>
+        <w:t>6. Click “Register Pokémon”</w:t>
+      </w:r>
+    </w:p>
+    <w:p>
+      <w:pPr>
+        <w:ind w:left="720"/>
+      </w:pPr>
+      <w:r>
+        <w:t>7. PRINT badge</w:t>
+      </w:r>
+    </w:p>
+    <w:p>
+      <w:r>
+        <w:br w:type="page"/>
+      </w:r>
+    </w:p>
+    <w:p>
+      <w:r>
+        <w:lastRenderedPageBreak/>
         <w:t>3. You’ve just been hired as the head coach of a struggling basketball</w:t>
       </w:r>
     </w:p>
@@ -445,6 +627,279 @@
     <w:p>
       <w:r>
         <w:t>point shot under pressure</w:t>
+      </w:r>
+    </w:p>
+    <w:p>
+      <w:r>
+        <w:t>Modules</w:t>
+      </w:r>
+    </w:p>
+    <w:p>
+      <w:pPr>
+        <w:ind w:left="720"/>
+      </w:pPr>
+      <w:r>
+        <w:t>1. SHOOT the ball at the net</w:t>
+      </w:r>
+    </w:p>
+    <w:p>
+      <w:pPr>
+        <w:ind w:left="720"/>
+      </w:pPr>
+      <w:r>
+        <w:t>2. COVER another play</w:t>
+      </w:r>
+    </w:p>
+    <w:p>
+      <w:pPr>
+        <w:ind w:left="720"/>
+      </w:pPr>
+      <w:r>
+        <w:t>3. PASS the ball to a teammate</w:t>
+      </w:r>
+    </w:p>
+    <w:p>
+      <w:pPr>
+        <w:ind w:left="720"/>
+      </w:pPr>
+      <w:r>
+        <w:t>4. OFFENSIVE PLAY</w:t>
+      </w:r>
+    </w:p>
+    <w:p>
+      <w:pPr>
+        <w:ind w:left="720"/>
+      </w:pPr>
+      <w:r>
+        <w:t>5. DEFENSIVE PLAY</w:t>
+      </w:r>
+    </w:p>
+    <w:p>
+      <w:pPr>
+        <w:ind w:left="720"/>
+      </w:pPr>
+      <w:r>
+        <w:t>6. HAIL MARY</w:t>
+      </w:r>
+    </w:p>
+    <w:p>
+      <w:r>
+        <w:t>SHOOT</w:t>
+      </w:r>
+    </w:p>
+    <w:p>
+      <w:pPr>
+        <w:ind w:left="720"/>
+      </w:pPr>
+      <w:r>
+        <w:t>1. Wait for an opening</w:t>
+      </w:r>
+    </w:p>
+    <w:p>
+      <w:pPr>
+        <w:ind w:left="720"/>
+      </w:pPr>
+      <w:r>
+        <w:t>2. Take aim at the net</w:t>
+      </w:r>
+    </w:p>
+    <w:p>
+      <w:pPr>
+        <w:ind w:left="720"/>
+      </w:pPr>
+      <w:r>
+        <w:t>3. Throw the ball at your target</w:t>
+      </w:r>
+    </w:p>
+    <w:p>
+      <w:r>
+        <w:t>COVER</w:t>
+      </w:r>
+    </w:p>
+    <w:p>
+      <w:pPr>
+        <w:ind w:left="720"/>
+      </w:pPr>
+      <w:r>
+        <w:t>1. Choose another player</w:t>
+      </w:r>
+    </w:p>
+    <w:p>
+      <w:pPr>
+        <w:ind w:left="720"/>
+      </w:pPr>
+      <w:r>
+        <w:t>2. Stand beside them</w:t>
+      </w:r>
+    </w:p>
+    <w:p>
+      <w:pPr>
+        <w:ind w:left="720"/>
+      </w:pPr>
+      <w:r>
+        <w:lastRenderedPageBreak/>
+        <w:t>3. Prevent the ball being passed to them or being taken from them</w:t>
+      </w:r>
+    </w:p>
+    <w:p>
+      <w:r>
+        <w:t>PASS</w:t>
+      </w:r>
+    </w:p>
+    <w:p>
+      <w:pPr>
+        <w:ind w:left="720"/>
+      </w:pPr>
+      <w:r>
+        <w:t>1. Choose the teammate</w:t>
+      </w:r>
+    </w:p>
+    <w:p>
+      <w:pPr>
+        <w:ind w:left="720"/>
+      </w:pPr>
+      <w:r>
+        <w:t>2. Wait for an opening</w:t>
+      </w:r>
+    </w:p>
+    <w:p>
+      <w:pPr>
+        <w:ind w:left="720"/>
+      </w:pPr>
+      <w:r>
+        <w:t>3. Throw the ball at the teammate</w:t>
+      </w:r>
+    </w:p>
+    <w:p>
+      <w:r>
+        <w:t>OFFENSIVE PLAY</w:t>
+      </w:r>
+    </w:p>
+    <w:p>
+      <w:pPr>
+        <w:ind w:left="720"/>
+      </w:pPr>
+      <w:r>
+        <w:t>1. Run to opposing team’s side of the court</w:t>
+      </w:r>
+    </w:p>
+    <w:p>
+      <w:pPr>
+        <w:ind w:left="720"/>
+      </w:pPr>
+      <w:r>
+        <w:t>2. PASS the ball to teammate 1</w:t>
+      </w:r>
+    </w:p>
+    <w:p>
+      <w:pPr>
+        <w:ind w:left="720"/>
+      </w:pPr>
+      <w:r>
+        <w:t>3. PASS the ball to teammate 2</w:t>
+      </w:r>
+    </w:p>
+    <w:p>
+      <w:pPr>
+        <w:ind w:left="720"/>
+      </w:pPr>
+      <w:r>
+        <w:t>4. PASS the ball to teammate 3</w:t>
+      </w:r>
+    </w:p>
+    <w:p>
+      <w:pPr>
+        <w:ind w:left="720"/>
+      </w:pPr>
+      <w:r>
+        <w:t>5. Teammate 3 SHOOTS ball (swish!)</w:t>
+      </w:r>
+    </w:p>
+    <w:p>
+      <w:r>
+        <w:t>DEFENSIVE PLAY</w:t>
+      </w:r>
+    </w:p>
+    <w:p>
+      <w:pPr>
+        <w:ind w:left="720"/>
+      </w:pPr>
+      <w:r>
+        <w:t>1. Two teammates COVER the opponent ball handler</w:t>
+      </w:r>
+    </w:p>
+    <w:p>
+      <w:pPr>
+        <w:ind w:left="720"/>
+      </w:pPr>
+      <w:r>
+        <w:t>2. Third teammate COVERS one opponent player</w:t>
+      </w:r>
+    </w:p>
+    <w:p>
+      <w:pPr>
+        <w:ind w:left="720"/>
+      </w:pPr>
+      <w:r>
+        <w:t>3. Fourth teammate COVERS another opponent player</w:t>
+      </w:r>
+    </w:p>
+    <w:p>
+      <w:pPr>
+        <w:ind w:left="720"/>
+      </w:pPr>
+      <w:r>
+        <w:t>4. Fifth teammate guards the rim</w:t>
+      </w:r>
+    </w:p>
+    <w:p>
+      <w:r>
+        <w:t>HAIL MARY</w:t>
+      </w:r>
+    </w:p>
+    <w:p>
+      <w:pPr>
+        <w:ind w:left="720"/>
+      </w:pPr>
+      <w:r>
+        <w:t>1. One player takes ball to other opposing team’s side of the court</w:t>
+      </w:r>
+    </w:p>
+    <w:p>
+      <w:pPr>
+        <w:ind w:left="720"/>
+      </w:pPr>
+      <w:r>
+        <w:t xml:space="preserve">2. Other four players COVER the </w:t>
+      </w:r>
+      <w:proofErr w:type="gramStart"/>
+      <w:r>
+        <w:t>ball-handler</w:t>
+      </w:r>
+      <w:proofErr w:type="gramEnd"/>
+    </w:p>
+    <w:p>
+      <w:pPr>
+        <w:ind w:left="720"/>
+      </w:pPr>
+      <w:r>
+        <w:t xml:space="preserve">3. </w:t>
+      </w:r>
+      <w:proofErr w:type="gramStart"/>
+      <w:r>
+        <w:t>Ball-handler</w:t>
+      </w:r>
+      <w:proofErr w:type="gramEnd"/>
+      <w:r>
+        <w:t xml:space="preserve"> reaches the three-point shot</w:t>
+      </w:r>
+    </w:p>
+    <w:p>
+      <w:pPr>
+        <w:ind w:left="720"/>
+      </w:pPr>
+      <w:r>
+        <w:t>4. Ball-handler SHOOTS</w:t>
       </w:r>
     </w:p>
     <w:sectPr>
@@ -455,6 +910,127 @@
     </w:sectPr>
   </w:body>
 </w:document>
+</file>
+
+<file path=word/numbering.xml><?xml version="1.0" encoding="utf-8"?>
+<w:numbering xmlns:wpc="http://schemas.microsoft.com/office/word/2010/wordprocessingCanvas" xmlns:cx="http://schemas.microsoft.com/office/drawing/2014/chartex" xmlns:cx1="http://schemas.microsoft.com/office/drawing/2015/9/8/chartex" xmlns:cx2="http://schemas.microsoft.com/office/drawing/2015/10/21/chartex" xmlns:cx3="http://schemas.microsoft.com/office/drawing/2016/5/9/chartex" xmlns:cx4="http://schemas.microsoft.com/office/drawing/2016/5/10/chartex" xmlns:cx5="http://schemas.microsoft.com/office/drawing/2016/5/11/chartex" xmlns:cx6="http://schemas.microsoft.com/office/drawing/2016/5/12/chartex" xmlns:cx7="http://schemas.microsoft.com/office/drawing/2016/5/13/chartex" xmlns:cx8="http://schemas.microsoft.com/office/drawing/2016/5/14/chartex" xmlns:mc="http://schemas.openxmlformats.org/markup-compatibility/2006" xmlns:aink="http://schemas.microsoft.com/office/drawing/2016/ink" xmlns:am3d="http://schemas.microsoft.com/office/drawing/2017/model3d" xmlns:o="urn:schemas-microsoft-com:office:office" xmlns:oel="http://schemas.microsoft.com/office/2019/extlst" xmlns:r="http://schemas.openxmlformats.org/officeDocument/2006/relationships" xmlns:m="http://schemas.openxmlformats.org/officeDocument/2006/math" xmlns:v="urn:schemas-microsoft-com:vml" xmlns:wp14="http://schemas.microsoft.com/office/word/2010/wordprocessingDrawing" xmlns:wp="http://schemas.openxmlformats.org/drawingml/2006/wordprocessingDrawing" xmlns:w10="urn:schemas-microsoft-com:office:word" xmlns:w="http://schemas.openxmlformats.org/wordprocessingml/2006/main" xmlns:w14="http://schemas.microsoft.com/office/word/2010/wordml" xmlns:w15="http://schemas.microsoft.com/office/word/2012/wordml" xmlns:w16cex="http://schemas.microsoft.com/office/word/2018/wordml/cex" xmlns:w16cid="http://schemas.microsoft.com/office/word/2016/wordml/cid" xmlns:w16="http://schemas.microsoft.com/office/word/2018/wordml" xmlns:w16du="http://schemas.microsoft.com/office/word/2023/wordml/word16du" xmlns:w16sdtdh="http://schemas.microsoft.com/office/word/2020/wordml/sdtdatahash" xmlns:w16sdtfl="http://schemas.microsoft.com/office/word/2024/wordml/sdtformatlock" xmlns:w16se="http://schemas.microsoft.com/office/word/2015/wordml/symex" xmlns:wpg="http://schemas.microsoft.com/office/word/2010/wordprocessingGroup" xmlns:wpi="http://schemas.microsoft.com/office/word/2010/wordprocessingInk" xmlns:wne="http://schemas.microsoft.com/office/word/2006/wordml" xmlns:wps="http://schemas.microsoft.com/office/word/2010/wordprocessingShape" mc:Ignorable="w14 w15 w16se w16cid w16 w16cex w16sdtdh w16sdtfl w16du wp14">
+  <w:abstractNum w:abstractNumId="0" w15:restartNumberingAfterBreak="0">
+    <w:nsid w:val="2BBE5CD7"/>
+    <w:multiLevelType w:val="hybridMultilevel"/>
+    <w:tmpl w:val="ED764C42"/>
+    <w:lvl w:ilvl="0" w:tplc="10090001">
+      <w:start w:val="1"/>
+      <w:numFmt w:val="bullet"/>
+      <w:lvlText w:val=""/>
+      <w:lvlJc w:val="left"/>
+      <w:pPr>
+        <w:ind w:left="720" w:hanging="360"/>
+      </w:pPr>
+      <w:rPr>
+        <w:rFonts w:ascii="Symbol" w:hAnsi="Symbol" w:hint="default"/>
+      </w:rPr>
+    </w:lvl>
+    <w:lvl w:ilvl="1" w:tplc="10090003" w:tentative="1">
+      <w:start w:val="1"/>
+      <w:numFmt w:val="bullet"/>
+      <w:lvlText w:val="o"/>
+      <w:lvlJc w:val="left"/>
+      <w:pPr>
+        <w:ind w:left="1440" w:hanging="360"/>
+      </w:pPr>
+      <w:rPr>
+        <w:rFonts w:ascii="Courier New" w:hAnsi="Courier New" w:cs="Courier New" w:hint="default"/>
+      </w:rPr>
+    </w:lvl>
+    <w:lvl w:ilvl="2" w:tplc="10090005" w:tentative="1">
+      <w:start w:val="1"/>
+      <w:numFmt w:val="bullet"/>
+      <w:lvlText w:val=""/>
+      <w:lvlJc w:val="left"/>
+      <w:pPr>
+        <w:ind w:left="2160" w:hanging="360"/>
+      </w:pPr>
+      <w:rPr>
+        <w:rFonts w:ascii="Wingdings" w:hAnsi="Wingdings" w:hint="default"/>
+      </w:rPr>
+    </w:lvl>
+    <w:lvl w:ilvl="3" w:tplc="10090001" w:tentative="1">
+      <w:start w:val="1"/>
+      <w:numFmt w:val="bullet"/>
+      <w:lvlText w:val=""/>
+      <w:lvlJc w:val="left"/>
+      <w:pPr>
+        <w:ind w:left="2880" w:hanging="360"/>
+      </w:pPr>
+      <w:rPr>
+        <w:rFonts w:ascii="Symbol" w:hAnsi="Symbol" w:hint="default"/>
+      </w:rPr>
+    </w:lvl>
+    <w:lvl w:ilvl="4" w:tplc="10090003" w:tentative="1">
+      <w:start w:val="1"/>
+      <w:numFmt w:val="bullet"/>
+      <w:lvlText w:val="o"/>
+      <w:lvlJc w:val="left"/>
+      <w:pPr>
+        <w:ind w:left="3600" w:hanging="360"/>
+      </w:pPr>
+      <w:rPr>
+        <w:rFonts w:ascii="Courier New" w:hAnsi="Courier New" w:cs="Courier New" w:hint="default"/>
+      </w:rPr>
+    </w:lvl>
+    <w:lvl w:ilvl="5" w:tplc="10090005" w:tentative="1">
+      <w:start w:val="1"/>
+      <w:numFmt w:val="bullet"/>
+      <w:lvlText w:val=""/>
+      <w:lvlJc w:val="left"/>
+      <w:pPr>
+        <w:ind w:left="4320" w:hanging="360"/>
+      </w:pPr>
+      <w:rPr>
+        <w:rFonts w:ascii="Wingdings" w:hAnsi="Wingdings" w:hint="default"/>
+      </w:rPr>
+    </w:lvl>
+    <w:lvl w:ilvl="6" w:tplc="10090001" w:tentative="1">
+      <w:start w:val="1"/>
+      <w:numFmt w:val="bullet"/>
+      <w:lvlText w:val=""/>
+      <w:lvlJc w:val="left"/>
+      <w:pPr>
+        <w:ind w:left="5040" w:hanging="360"/>
+      </w:pPr>
+      <w:rPr>
+        <w:rFonts w:ascii="Symbol" w:hAnsi="Symbol" w:hint="default"/>
+      </w:rPr>
+    </w:lvl>
+    <w:lvl w:ilvl="7" w:tplc="10090003" w:tentative="1">
+      <w:start w:val="1"/>
+      <w:numFmt w:val="bullet"/>
+      <w:lvlText w:val="o"/>
+      <w:lvlJc w:val="left"/>
+      <w:pPr>
+        <w:ind w:left="5760" w:hanging="360"/>
+      </w:pPr>
+      <w:rPr>
+        <w:rFonts w:ascii="Courier New" w:hAnsi="Courier New" w:cs="Courier New" w:hint="default"/>
+      </w:rPr>
+    </w:lvl>
+    <w:lvl w:ilvl="8" w:tplc="10090005" w:tentative="1">
+      <w:start w:val="1"/>
+      <w:numFmt w:val="bullet"/>
+      <w:lvlText w:val=""/>
+      <w:lvlJc w:val="left"/>
+      <w:pPr>
+        <w:ind w:left="6480" w:hanging="360"/>
+      </w:pPr>
+      <w:rPr>
+        <w:rFonts w:ascii="Wingdings" w:hAnsi="Wingdings" w:hint="default"/>
+      </w:rPr>
+    </w:lvl>
+  </w:abstractNum>
+  <w:num w:numId="1" w16cid:durableId="1783765611">
+    <w:abstractNumId w:val="0"/>
+  </w:num>
+</w:numbering>
 </file>
 
 <file path=word/styles.xml><?xml version="1.0" encoding="utf-8"?>

</xml_diff>